<commit_message>
report rebuilt with pdf
</commit_message>
<xml_diff>
--- a/out/DSA_Linked_List_Report.docx
+++ b/out/DSA_Linked_List_Report.docx
@@ -4,18 +4,19 @@
   <w:body>
     <w:tbl>
       <w:tblPr>
-        <w:tblW w:type="dxa" w:w="9014"/>
+        <w:tblW w:type="dxa" w:w="9865"/>
         <w:tblLayout w:type="fixed"/>
         <w:tblLook w:firstColumn="1" w:firstRow="1" w:lastColumn="0" w:lastRow="0" w:noHBand="0" w:noVBand="1" w:val="04A0"/>
       </w:tblPr>
       <w:tblGrid>
-        <w:gridCol w:w="3005"/>
-        <w:gridCol w:w="6009"/>
+        <w:gridCol w:w="2551"/>
+        <w:gridCol w:w="3572"/>
+        <w:gridCol w:w="3742"/>
       </w:tblGrid>
       <w:tr>
         <w:tc>
           <w:tcPr>
-            <w:tcW w:type="dxa" w:w="3005"/>
+            <w:tcW w:type="dxa" w:w="2551"/>
             <w:tcBorders>
               <w:top w:val="nil"/>
               <w:left w:val="nil"/>
@@ -25,12 +26,13 @@
           </w:tcPr>
           <w:p>
             <w:pPr>
-              <w:spacing w:line="240" w:lineRule="auto"/>
+              <w:pStyle w:val="TableText"/>
+              <w:spacing w:line="240" w:lineRule="auto" w:before="0" w:after="0"/>
             </w:pPr>
             <w:r>
               <w:drawing>
                 <wp:inline xmlns:a="http://schemas.openxmlformats.org/drawingml/2006/main" xmlns:pic="http://schemas.openxmlformats.org/drawingml/2006/picture">
-                  <wp:extent cx="1648158" cy="612000"/>
+                  <wp:extent cx="1376697" cy="511200"/>
                   <wp:docPr id="1" name="Picture 1"/>
                   <wp:cNvGraphicFramePr>
                     <a:graphicFrameLocks noChangeAspect="1"/>
@@ -51,7 +53,7 @@
                         <pic:spPr>
                           <a:xfrm>
                             <a:off x="0" y="0"/>
-                            <a:ext cx="1648158" cy="612000"/>
+                            <a:ext cx="1376697" cy="511200"/>
                           </a:xfrm>
                           <a:prstGeom prst="rect"/>
                         </pic:spPr>
@@ -65,7 +67,7 @@
         </w:tc>
         <w:tc>
           <w:tcPr>
-            <w:tcW w:type="dxa" w:w="6009"/>
+            <w:tcW w:type="dxa" w:w="3572"/>
             <w:tcBorders>
               <w:top w:val="nil"/>
               <w:left w:val="nil"/>
@@ -75,32 +77,50 @@
           </w:tcPr>
           <w:p>
             <w:pPr>
-              <w:spacing w:before="80" w:after="80" w:line="240" w:lineRule="auto"/>
+              <w:pStyle w:val="TableText"/>
+              <w:spacing w:line="240" w:lineRule="auto" w:before="160" w:after="0"/>
             </w:pPr>
             <w:r>
               <w:rPr>
                 <w:rFonts w:ascii="Times New Roman" w:hAnsi="Times New Roman" w:eastAsia="Times New Roman" w:cs="Times New Roman"/>
                 <w:b/>
-                <w:sz w:val="32"/>
+                <w:i w:val="0"/>
+                <w:sz w:val="28"/>
               </w:rPr>
               <w:t>Assignment Cover Sheet</w:t>
             </w:r>
           </w:p>
+        </w:tc>
+        <w:tc>
+          <w:tcPr>
+            <w:tcW w:type="dxa" w:w="3742"/>
+            <w:tcBorders>
+              <w:top w:val="nil"/>
+              <w:left w:val="nil"/>
+              <w:bottom w:val="nil"/>
+              <w:right w:val="nil"/>
+            </w:tcBorders>
+          </w:tcPr>
+          <w:p>
+            <w:pPr>
+              <w:pStyle w:val="TableText"/>
+              <w:spacing w:line="240" w:lineRule="auto" w:before="0" w:after="0"/>
+            </w:pPr>
+          </w:p>
           <w:tbl>
             <w:tblPr>
-              <w:tblW w:type="dxa" w:w="3969"/>
-              <w:jc w:val="right"/>
+              <w:tblW w:type="dxa" w:w="3526"/>
               <w:tblLayout w:type="fixed"/>
               <w:tblLook w:firstColumn="1" w:firstRow="1" w:lastColumn="0" w:lastRow="0" w:noHBand="0" w:noVBand="1" w:val="04A0"/>
             </w:tblPr>
             <w:tblGrid>
-              <w:gridCol w:w="3061"/>
-              <w:gridCol w:w="907"/>
+              <w:gridCol w:w="2806"/>
+              <w:gridCol w:w="720"/>
             </w:tblGrid>
             <w:tr>
               <w:tc>
                 <w:tcPr>
-                  <w:tcW w:type="dxa" w:w="3061"/>
+                  <w:tcW w:type="dxa" w:w="2806"/>
                   <w:tcBorders>
                     <w:top w:val="single" w:sz="6" w:color="000000"/>
                     <w:left w:val="single" w:sz="6" w:color="000000"/>
@@ -110,12 +130,13 @@
                 </w:tcPr>
                 <w:p>
                   <w:pPr>
+                    <w:pStyle w:val="TableText"/>
                     <w:spacing w:line="240" w:lineRule="auto" w:before="80" w:after="80"/>
                   </w:pPr>
                   <w:r>
                     <w:drawing>
                       <wp:inline xmlns:a="http://schemas.openxmlformats.org/drawingml/2006/main" xmlns:pic="http://schemas.openxmlformats.org/drawingml/2006/picture">
-                        <wp:extent cx="645750" cy="378000"/>
+                        <wp:extent cx="738000" cy="432000"/>
                         <wp:docPr id="2" name="Picture 2"/>
                         <wp:cNvGraphicFramePr>
                           <a:graphicFrameLocks noChangeAspect="1"/>
@@ -136,7 +157,7 @@
                               <pic:spPr>
                                 <a:xfrm>
                                   <a:off x="0" y="0"/>
-                                  <a:ext cx="645750" cy="378000"/>
+                                  <a:ext cx="738000" cy="432000"/>
                                 </a:xfrm>
                                 <a:prstGeom prst="rect"/>
                               </pic:spPr>
@@ -150,21 +171,7 @@
               </w:tc>
               <w:tc>
                 <w:tcPr>
-                  <w:tcW w:type="dxa" w:w="907"/>
-                  <w:tcBorders>
-                    <w:top w:val="single" w:sz="6" w:color="000000"/>
-                    <w:left w:val="single" w:sz="6" w:color="000000"/>
-                    <w:bottom w:val="single" w:sz="6" w:color="000000"/>
-                    <w:right w:val="single" w:sz="6" w:color="000000"/>
-                  </w:tcBorders>
-                </w:tcPr>
-                <w:p/>
-              </w:tc>
-            </w:tr>
-            <w:tr>
-              <w:tc>
-                <w:tcPr>
-                  <w:tcW w:type="dxa" w:w="3061"/>
+                  <w:tcW w:type="dxa" w:w="720"/>
                   <w:tcBorders>
                     <w:top w:val="single" w:sz="6" w:color="000000"/>
                     <w:left w:val="single" w:sz="6" w:color="000000"/>
@@ -174,6 +181,26 @@
                 </w:tcPr>
                 <w:p>
                   <w:pPr>
+                    <w:pStyle w:val="TableText"/>
+                    <w:spacing w:line="240" w:lineRule="auto" w:before="0" w:after="0"/>
+                  </w:pPr>
+                </w:p>
+              </w:tc>
+            </w:tr>
+            <w:tr>
+              <w:tc>
+                <w:tcPr>
+                  <w:tcW w:type="dxa" w:w="2806"/>
+                  <w:tcBorders>
+                    <w:top w:val="single" w:sz="6" w:color="000000"/>
+                    <w:left w:val="single" w:sz="6" w:color="000000"/>
+                    <w:bottom w:val="single" w:sz="6" w:color="000000"/>
+                    <w:right w:val="single" w:sz="6" w:color="000000"/>
+                  </w:tcBorders>
+                </w:tcPr>
+                <w:p>
+                  <w:pPr>
+                    <w:pStyle w:val="TableText"/>
                     <w:spacing w:line="240" w:lineRule="auto" w:before="80" w:after="80"/>
                   </w:pPr>
                   <w:r>
@@ -214,7 +241,7 @@
               </w:tc>
               <w:tc>
                 <w:tcPr>
-                  <w:tcW w:type="dxa" w:w="907"/>
+                  <w:tcW w:type="dxa" w:w="720"/>
                   <w:tcBorders>
                     <w:top w:val="single" w:sz="6" w:color="000000"/>
                     <w:left w:val="single" w:sz="6" w:color="000000"/>
@@ -222,13 +249,19 @@
                     <w:right w:val="single" w:sz="6" w:color="000000"/>
                   </w:tcBorders>
                 </w:tcPr>
-                <w:p/>
+                <w:p>
+                  <w:pPr>
+                    <w:pStyle w:val="TableText"/>
+                    <w:spacing w:line="240" w:lineRule="auto" w:before="0" w:after="0"/>
+                  </w:pPr>
+                </w:p>
               </w:tc>
             </w:tr>
           </w:tbl>
           <w:p>
             <w:pPr>
-              <w:spacing w:line="240" w:lineRule="auto" w:after="0"/>
+              <w:pStyle w:val="TableText"/>
+              <w:spacing w:line="240" w:lineRule="auto" w:before="0" w:after="0"/>
             </w:pPr>
           </w:p>
         </w:tc>
@@ -236,62 +269,32 @@
     </w:tbl>
     <w:p>
       <w:pPr>
-        <w:spacing w:line="240" w:lineRule="auto"/>
-      </w:pPr>
-    </w:p>
-    <w:p>
-      <w:pPr>
-        <w:spacing w:line="240" w:lineRule="auto" w:after="120"/>
+        <w:spacing w:line="240" w:lineRule="auto" w:before="320" w:after="160"/>
       </w:pPr>
       <w:r>
         <w:rPr>
           <w:rFonts w:ascii="Times New Roman" w:hAnsi="Times New Roman" w:eastAsia="Times New Roman" w:cs="Times New Roman"/>
           <w:b/>
-          <w:sz w:val="24"/>
+          <w:i w:val="0"/>
+          <w:sz w:val="21"/>
         </w:rPr>
         <w:t>This cover sheet must be completed and added to the front of every assignment</w:t>
       </w:r>
     </w:p>
     <w:tbl>
       <w:tblPr>
-        <w:tblW w:type="dxa" w:w="9014"/>
+        <w:tblW w:type="dxa" w:w="9865"/>
         <w:tblLayout w:type="fixed"/>
         <w:tblLook w:firstColumn="1" w:firstRow="1" w:lastColumn="0" w:lastRow="0" w:noHBand="0" w:noVBand="1" w:val="04A0"/>
       </w:tblPr>
       <w:tblGrid>
-        <w:gridCol w:w="3175"/>
-        <w:gridCol w:w="5839"/>
+        <w:gridCol w:w="3260"/>
+        <w:gridCol w:w="6605"/>
       </w:tblGrid>
       <w:tr>
         <w:tc>
           <w:tcPr>
-            <w:tcW w:type="dxa" w:w="3175"/>
-            <w:tcBorders>
-              <w:top w:val="single" w:sz="6" w:color="000000"/>
-              <w:left w:val="single" w:sz="6" w:color="000000"/>
-              <w:bottom w:val="single" w:sz="6" w:color="000000"/>
-              <w:right w:val="single" w:sz="6" w:color="000000"/>
-            </w:tcBorders>
-            <w:shd w:val="clear" w:color="auto" w:fill="D9D9D9"/>
-          </w:tcPr>
-          <w:p>
-            <w:pPr>
-              <w:pStyle w:val="TableText"/>
-            </w:pPr>
-            <w:r>
-              <w:rPr>
-                <w:rFonts w:ascii="Times New Roman" w:hAnsi="Times New Roman" w:eastAsia="Times New Roman" w:cs="Times New Roman"/>
-                <w:b/>
-                <w:i/>
-                <w:sz w:val="24"/>
-              </w:rPr>
-              <w:t>Learner Name and Surname:</w:t>
-            </w:r>
-          </w:p>
-        </w:tc>
-        <w:tc>
-          <w:tcPr>
-            <w:tcW w:type="dxa" w:w="5839"/>
+            <w:tcW w:type="dxa" w:w="3260"/>
             <w:tcBorders>
               <w:top w:val="single" w:sz="6" w:color="000000"/>
               <w:left w:val="single" w:sz="6" w:color="000000"/>
@@ -302,49 +305,22 @@
           <w:p>
             <w:pPr>
               <w:pStyle w:val="TableText"/>
-            </w:pPr>
-            <w:r>
-              <w:rPr>
-                <w:rFonts w:ascii="Times New Roman" w:hAnsi="Times New Roman" w:eastAsia="Times New Roman" w:cs="Times New Roman"/>
-                <w:b w:val="0"/>
-                <w:i w:val="0"/>
-                <w:sz w:val="24"/>
-              </w:rPr>
-              <w:t>Imran Hossain Chowdhury</w:t>
-            </w:r>
-          </w:p>
-        </w:tc>
-      </w:tr>
-      <w:tr>
-        <w:tc>
-          <w:tcPr>
-            <w:tcW w:type="dxa" w:w="3175"/>
-            <w:tcBorders>
-              <w:top w:val="single" w:sz="6" w:color="000000"/>
-              <w:left w:val="single" w:sz="6" w:color="000000"/>
-              <w:bottom w:val="single" w:sz="6" w:color="000000"/>
-              <w:right w:val="single" w:sz="6" w:color="000000"/>
-            </w:tcBorders>
-            <w:shd w:val="clear" w:color="auto" w:fill="D9D9D9"/>
-          </w:tcPr>
-          <w:p>
-            <w:pPr>
-              <w:pStyle w:val="TableText"/>
+              <w:spacing w:line="240" w:lineRule="auto" w:before="70" w:after="70"/>
             </w:pPr>
             <w:r>
               <w:rPr>
                 <w:rFonts w:ascii="Times New Roman" w:hAnsi="Times New Roman" w:eastAsia="Times New Roman" w:cs="Times New Roman"/>
                 <w:b/>
                 <w:i/>
-                <w:sz w:val="24"/>
+                <w:sz w:val="21"/>
               </w:rPr>
-              <w:t>Learner Registration No.</w:t>
+              <w:t>Learner Name and Surname:</w:t>
             </w:r>
           </w:p>
         </w:tc>
         <w:tc>
           <w:tcPr>
-            <w:tcW w:type="dxa" w:w="5839"/>
+            <w:tcW w:type="dxa" w:w="6605"/>
             <w:tcBorders>
               <w:top w:val="single" w:sz="6" w:color="000000"/>
               <w:left w:val="single" w:sz="6" w:color="000000"/>
@@ -355,15 +331,16 @@
           <w:p>
             <w:pPr>
               <w:pStyle w:val="TableText"/>
+              <w:spacing w:line="240" w:lineRule="auto" w:before="70" w:after="70"/>
             </w:pPr>
             <w:r>
               <w:rPr>
                 <w:rFonts w:ascii="Times New Roman" w:hAnsi="Times New Roman" w:eastAsia="Times New Roman" w:cs="Times New Roman"/>
                 <w:b w:val="0"/>
                 <w:i w:val="0"/>
-                <w:sz w:val="24"/>
+                <w:sz w:val="21"/>
               </w:rPr>
-              <w:t>11248</w:t>
+              <w:t>Imran Hossain Chowdhury</w:t>
             </w:r>
           </w:p>
         </w:tc>
@@ -371,33 +348,7 @@
       <w:tr>
         <w:tc>
           <w:tcPr>
-            <w:tcW w:type="dxa" w:w="3175"/>
-            <w:tcBorders>
-              <w:top w:val="single" w:sz="6" w:color="000000"/>
-              <w:left w:val="single" w:sz="6" w:color="000000"/>
-              <w:bottom w:val="single" w:sz="6" w:color="000000"/>
-              <w:right w:val="single" w:sz="6" w:color="000000"/>
-            </w:tcBorders>
-            <w:shd w:val="clear" w:color="auto" w:fill="D9D9D9"/>
-          </w:tcPr>
-          <w:p>
-            <w:pPr>
-              <w:pStyle w:val="TableText"/>
-            </w:pPr>
-            <w:r>
-              <w:rPr>
-                <w:rFonts w:ascii="Times New Roman" w:hAnsi="Times New Roman" w:eastAsia="Times New Roman" w:cs="Times New Roman"/>
-                <w:b/>
-                <w:i/>
-                <w:sz w:val="24"/>
-              </w:rPr>
-              <w:t>Study Centre Name</w:t>
-            </w:r>
-          </w:p>
-        </w:tc>
-        <w:tc>
-          <w:tcPr>
-            <w:tcW w:type="dxa" w:w="5839"/>
+            <w:tcW w:type="dxa" w:w="3260"/>
             <w:tcBorders>
               <w:top w:val="single" w:sz="6" w:color="000000"/>
               <w:left w:val="single" w:sz="6" w:color="000000"/>
@@ -408,49 +359,22 @@
           <w:p>
             <w:pPr>
               <w:pStyle w:val="TableText"/>
-            </w:pPr>
-            <w:r>
-              <w:rPr>
-                <w:rFonts w:ascii="Times New Roman" w:hAnsi="Times New Roman" w:eastAsia="Times New Roman" w:cs="Times New Roman"/>
-                <w:b/>
-                <w:i w:val="0"/>
-                <w:sz w:val="24"/>
-              </w:rPr>
-              <w:t>Learn Key Institute</w:t>
-            </w:r>
-          </w:p>
-        </w:tc>
-      </w:tr>
-      <w:tr>
-        <w:tc>
-          <w:tcPr>
-            <w:tcW w:type="dxa" w:w="3175"/>
-            <w:tcBorders>
-              <w:top w:val="single" w:sz="6" w:color="000000"/>
-              <w:left w:val="single" w:sz="6" w:color="000000"/>
-              <w:bottom w:val="single" w:sz="6" w:color="000000"/>
-              <w:right w:val="single" w:sz="6" w:color="000000"/>
-            </w:tcBorders>
-            <w:shd w:val="clear" w:color="auto" w:fill="D9D9D9"/>
-          </w:tcPr>
-          <w:p>
-            <w:pPr>
-              <w:pStyle w:val="TableText"/>
+              <w:spacing w:line="240" w:lineRule="auto" w:before="70" w:after="70"/>
             </w:pPr>
             <w:r>
               <w:rPr>
                 <w:rFonts w:ascii="Times New Roman" w:hAnsi="Times New Roman" w:eastAsia="Times New Roman" w:cs="Times New Roman"/>
                 <w:b/>
                 <w:i/>
-                <w:sz w:val="24"/>
+                <w:sz w:val="21"/>
               </w:rPr>
-              <w:t>Qualification Title</w:t>
+              <w:t>Learner Registration No.</w:t>
             </w:r>
           </w:p>
         </w:tc>
         <w:tc>
           <w:tcPr>
-            <w:tcW w:type="dxa" w:w="5839"/>
+            <w:tcW w:type="dxa" w:w="6605"/>
             <w:tcBorders>
               <w:top w:val="single" w:sz="6" w:color="000000"/>
               <w:left w:val="single" w:sz="6" w:color="000000"/>
@@ -461,15 +385,16 @@
           <w:p>
             <w:pPr>
               <w:pStyle w:val="TableText"/>
+              <w:spacing w:line="240" w:lineRule="auto" w:before="70" w:after="70"/>
             </w:pPr>
             <w:r>
               <w:rPr>
                 <w:rFonts w:ascii="Times New Roman" w:hAnsi="Times New Roman" w:eastAsia="Times New Roman" w:cs="Times New Roman"/>
                 <w:b w:val="0"/>
                 <w:i w:val="0"/>
-                <w:sz w:val="24"/>
+                <w:sz w:val="21"/>
               </w:rPr>
-              <w:t>Undergraduate Diploma in Software Design MQF (Lv.5) — Group A</w:t>
+              <w:t>11248</w:t>
             </w:r>
           </w:p>
         </w:tc>
@@ -477,33 +402,7 @@
       <w:tr>
         <w:tc>
           <w:tcPr>
-            <w:tcW w:type="dxa" w:w="3175"/>
-            <w:tcBorders>
-              <w:top w:val="single" w:sz="6" w:color="000000"/>
-              <w:left w:val="single" w:sz="6" w:color="000000"/>
-              <w:bottom w:val="single" w:sz="6" w:color="000000"/>
-              <w:right w:val="single" w:sz="6" w:color="000000"/>
-            </w:tcBorders>
-            <w:shd w:val="clear" w:color="auto" w:fill="D9D9D9"/>
-          </w:tcPr>
-          <w:p>
-            <w:pPr>
-              <w:pStyle w:val="TableText"/>
-            </w:pPr>
-            <w:r>
-              <w:rPr>
-                <w:rFonts w:ascii="Times New Roman" w:hAnsi="Times New Roman" w:eastAsia="Times New Roman" w:cs="Times New Roman"/>
-                <w:b/>
-                <w:i/>
-                <w:sz w:val="24"/>
-              </w:rPr>
-              <w:t>Unit Reference No.</w:t>
-            </w:r>
-          </w:p>
-        </w:tc>
-        <w:tc>
-          <w:tcPr>
-            <w:tcW w:type="dxa" w:w="5839"/>
+            <w:tcW w:type="dxa" w:w="3260"/>
             <w:tcBorders>
               <w:top w:val="single" w:sz="6" w:color="000000"/>
               <w:left w:val="single" w:sz="6" w:color="000000"/>
@@ -514,48 +413,22 @@
           <w:p>
             <w:pPr>
               <w:pStyle w:val="TableText"/>
-            </w:pPr>
-            <w:r>
-              <w:rPr>
-                <w:rFonts w:ascii="Times New Roman" w:hAnsi="Times New Roman" w:eastAsia="Times New Roman" w:cs="Times New Roman"/>
-                <w:b w:val="0"/>
-                <w:i w:val="0"/>
-                <w:sz w:val="24"/>
-              </w:rPr>
-            </w:r>
-          </w:p>
-        </w:tc>
-      </w:tr>
-      <w:tr>
-        <w:tc>
-          <w:tcPr>
-            <w:tcW w:type="dxa" w:w="3175"/>
-            <w:tcBorders>
-              <w:top w:val="single" w:sz="6" w:color="000000"/>
-              <w:left w:val="single" w:sz="6" w:color="000000"/>
-              <w:bottom w:val="single" w:sz="6" w:color="000000"/>
-              <w:right w:val="single" w:sz="6" w:color="000000"/>
-            </w:tcBorders>
-            <w:shd w:val="clear" w:color="auto" w:fill="D9D9D9"/>
-          </w:tcPr>
-          <w:p>
-            <w:pPr>
-              <w:pStyle w:val="TableText"/>
+              <w:spacing w:line="240" w:lineRule="auto" w:before="70" w:after="70"/>
             </w:pPr>
             <w:r>
               <w:rPr>
                 <w:rFonts w:ascii="Times New Roman" w:hAnsi="Times New Roman" w:eastAsia="Times New Roman" w:cs="Times New Roman"/>
                 <w:b/>
                 <w:i/>
-                <w:sz w:val="24"/>
+                <w:sz w:val="21"/>
               </w:rPr>
-              <w:t>Unit Title</w:t>
+              <w:t>Study Centre Name</w:t>
             </w:r>
           </w:p>
         </w:tc>
         <w:tc>
           <w:tcPr>
-            <w:tcW w:type="dxa" w:w="5839"/>
+            <w:tcW w:type="dxa" w:w="6605"/>
             <w:tcBorders>
               <w:top w:val="single" w:sz="6" w:color="000000"/>
               <w:left w:val="single" w:sz="6" w:color="000000"/>
@@ -566,15 +439,16 @@
           <w:p>
             <w:pPr>
               <w:pStyle w:val="TableText"/>
+              <w:spacing w:line="240" w:lineRule="auto" w:before="70" w:after="70"/>
             </w:pPr>
             <w:r>
               <w:rPr>
                 <w:rFonts w:ascii="Times New Roman" w:hAnsi="Times New Roman" w:eastAsia="Times New Roman" w:cs="Times New Roman"/>
-                <w:b w:val="0"/>
+                <w:b/>
                 <w:i w:val="0"/>
-                <w:sz w:val="24"/>
+                <w:sz w:val="21"/>
               </w:rPr>
-              <w:t>Unit 3: Data Structures and Algorithms in Software</w:t>
+              <w:t>Learn Key Institute</w:t>
             </w:r>
           </w:p>
         </w:tc>
@@ -582,33 +456,7 @@
       <w:tr>
         <w:tc>
           <w:tcPr>
-            <w:tcW w:type="dxa" w:w="3175"/>
-            <w:tcBorders>
-              <w:top w:val="single" w:sz="6" w:color="000000"/>
-              <w:left w:val="single" w:sz="6" w:color="000000"/>
-              <w:bottom w:val="single" w:sz="6" w:color="000000"/>
-              <w:right w:val="single" w:sz="6" w:color="000000"/>
-            </w:tcBorders>
-            <w:shd w:val="clear" w:color="auto" w:fill="D9D9D9"/>
-          </w:tcPr>
-          <w:p>
-            <w:pPr>
-              <w:pStyle w:val="TableText"/>
-            </w:pPr>
-            <w:r>
-              <w:rPr>
-                <w:rFonts w:ascii="Times New Roman" w:hAnsi="Times New Roman" w:eastAsia="Times New Roman" w:cs="Times New Roman"/>
-                <w:b/>
-                <w:i/>
-                <w:sz w:val="24"/>
-              </w:rPr>
-              <w:t>Assignment Title</w:t>
-            </w:r>
-          </w:p>
-        </w:tc>
-        <w:tc>
-          <w:tcPr>
-            <w:tcW w:type="dxa" w:w="5839"/>
+            <w:tcW w:type="dxa" w:w="3260"/>
             <w:tcBorders>
               <w:top w:val="single" w:sz="6" w:color="000000"/>
               <w:left w:val="single" w:sz="6" w:color="000000"/>
@@ -619,49 +467,22 @@
           <w:p>
             <w:pPr>
               <w:pStyle w:val="TableText"/>
-            </w:pPr>
-            <w:r>
-              <w:rPr>
-                <w:rFonts w:ascii="Times New Roman" w:hAnsi="Times New Roman" w:eastAsia="Times New Roman" w:cs="Times New Roman"/>
-                <w:b w:val="0"/>
-                <w:i w:val="0"/>
-                <w:sz w:val="24"/>
-              </w:rPr>
-              <w:t>Inserting a New Cell at the End of a Linked List</w:t>
-            </w:r>
-          </w:p>
-        </w:tc>
-      </w:tr>
-      <w:tr>
-        <w:tc>
-          <w:tcPr>
-            <w:tcW w:type="dxa" w:w="3175"/>
-            <w:tcBorders>
-              <w:top w:val="single" w:sz="6" w:color="000000"/>
-              <w:left w:val="single" w:sz="6" w:color="000000"/>
-              <w:bottom w:val="single" w:sz="6" w:color="000000"/>
-              <w:right w:val="single" w:sz="6" w:color="000000"/>
-            </w:tcBorders>
-            <w:shd w:val="clear" w:color="auto" w:fill="D9D9D9"/>
-          </w:tcPr>
-          <w:p>
-            <w:pPr>
-              <w:pStyle w:val="TableText"/>
+              <w:spacing w:line="240" w:lineRule="auto" w:before="70" w:after="70"/>
             </w:pPr>
             <w:r>
               <w:rPr>
                 <w:rFonts w:ascii="Times New Roman" w:hAnsi="Times New Roman" w:eastAsia="Times New Roman" w:cs="Times New Roman"/>
                 <w:b/>
                 <w:i/>
-                <w:sz w:val="24"/>
+                <w:sz w:val="21"/>
               </w:rPr>
-              <w:t>Submission Date</w:t>
+              <w:t>Qualification Title</w:t>
             </w:r>
           </w:p>
         </w:tc>
         <w:tc>
           <w:tcPr>
-            <w:tcW w:type="dxa" w:w="5839"/>
+            <w:tcW w:type="dxa" w:w="6605"/>
             <w:tcBorders>
               <w:top w:val="single" w:sz="6" w:color="000000"/>
               <w:left w:val="single" w:sz="6" w:color="000000"/>
@@ -672,14 +493,16 @@
           <w:p>
             <w:pPr>
               <w:pStyle w:val="TableText"/>
+              <w:spacing w:line="240" w:lineRule="auto" w:before="70" w:after="70"/>
             </w:pPr>
             <w:r>
               <w:rPr>
                 <w:rFonts w:ascii="Times New Roman" w:hAnsi="Times New Roman" w:eastAsia="Times New Roman" w:cs="Times New Roman"/>
                 <w:b w:val="0"/>
                 <w:i w:val="0"/>
-                <w:sz w:val="24"/>
+                <w:sz w:val="21"/>
               </w:rPr>
+              <w:t>Undergraduate Diploma in Software Design MQF (Lv.5) — Group A</w:t>
             </w:r>
           </w:p>
         </w:tc>
@@ -687,33 +510,7 @@
       <w:tr>
         <w:tc>
           <w:tcPr>
-            <w:tcW w:type="dxa" w:w="3175"/>
-            <w:tcBorders>
-              <w:top w:val="single" w:sz="6" w:color="000000"/>
-              <w:left w:val="single" w:sz="6" w:color="000000"/>
-              <w:bottom w:val="single" w:sz="6" w:color="000000"/>
-              <w:right w:val="single" w:sz="6" w:color="000000"/>
-            </w:tcBorders>
-            <w:shd w:val="clear" w:color="auto" w:fill="D9D9D9"/>
-          </w:tcPr>
-          <w:p>
-            <w:pPr>
-              <w:pStyle w:val="TableText"/>
-            </w:pPr>
-            <w:r>
-              <w:rPr>
-                <w:rFonts w:ascii="Times New Roman" w:hAnsi="Times New Roman" w:eastAsia="Times New Roman" w:cs="Times New Roman"/>
-                <w:b/>
-                <w:i/>
-                <w:sz w:val="24"/>
-              </w:rPr>
-              <w:t>Word Count</w:t>
-            </w:r>
-          </w:p>
-        </w:tc>
-        <w:tc>
-          <w:tcPr>
-            <w:tcW w:type="dxa" w:w="5839"/>
+            <w:tcW w:type="dxa" w:w="3260"/>
             <w:tcBorders>
               <w:top w:val="single" w:sz="6" w:color="000000"/>
               <w:left w:val="single" w:sz="6" w:color="000000"/>
@@ -724,32 +521,22 @@
           <w:p>
             <w:pPr>
               <w:pStyle w:val="TableText"/>
+              <w:spacing w:line="240" w:lineRule="auto" w:before="70" w:after="70"/>
             </w:pPr>
             <w:r>
               <w:rPr>
                 <w:rFonts w:ascii="Times New Roman" w:hAnsi="Times New Roman" w:eastAsia="Times New Roman" w:cs="Times New Roman"/>
-                <w:b w:val="0"/>
-                <w:i w:val="0"/>
-                <w:sz w:val="24"/>
+                <w:b/>
+                <w:i/>
+                <w:sz w:val="21"/>
               </w:rPr>
-              <w:t>4,339 words (excluding the front page, contents, figures, code, references and appendices)</w:t>
+              <w:t>Unit Reference No.</w:t>
             </w:r>
           </w:p>
         </w:tc>
-      </w:tr>
-    </w:tbl>
-    <w:tbl>
-      <w:tblPr>
-        <w:tblW w:type="dxa" w:w="9014"/>
-        <w:tblLook w:firstColumn="1" w:firstRow="1" w:lastColumn="0" w:lastRow="0" w:noHBand="0" w:noVBand="1" w:val="04A0"/>
-      </w:tblPr>
-      <w:tblGrid>
-        <w:gridCol w:w="9014"/>
-      </w:tblGrid>
-      <w:tr>
         <w:tc>
           <w:tcPr>
-            <w:tcW w:type="dxa" w:w="9014"/>
+            <w:tcW w:type="dxa" w:w="6605"/>
             <w:tcBorders>
               <w:top w:val="single" w:sz="6" w:color="000000"/>
               <w:left w:val="single" w:sz="6" w:color="000000"/>
@@ -760,13 +547,266 @@
           <w:p>
             <w:pPr>
               <w:pStyle w:val="TableText"/>
-              <w:spacing w:after="80"/>
+              <w:spacing w:line="240" w:lineRule="auto" w:before="70" w:after="70"/>
+            </w:pPr>
+            <w:r>
+              <w:rPr>
+                <w:rFonts w:ascii="Times New Roman" w:hAnsi="Times New Roman" w:eastAsia="Times New Roman" w:cs="Times New Roman"/>
+                <w:b w:val="0"/>
+                <w:i w:val="0"/>
+                <w:sz w:val="21"/>
+              </w:rPr>
+              <w:t>Unit 3</w:t>
+            </w:r>
+          </w:p>
+        </w:tc>
+      </w:tr>
+      <w:tr>
+        <w:tc>
+          <w:tcPr>
+            <w:tcW w:type="dxa" w:w="3260"/>
+            <w:tcBorders>
+              <w:top w:val="single" w:sz="6" w:color="000000"/>
+              <w:left w:val="single" w:sz="6" w:color="000000"/>
+              <w:bottom w:val="single" w:sz="6" w:color="000000"/>
+              <w:right w:val="single" w:sz="6" w:color="000000"/>
+            </w:tcBorders>
+          </w:tcPr>
+          <w:p>
+            <w:pPr>
+              <w:pStyle w:val="TableText"/>
+              <w:spacing w:line="240" w:lineRule="auto" w:before="70" w:after="70"/>
             </w:pPr>
             <w:r>
               <w:rPr>
                 <w:rFonts w:ascii="Times New Roman" w:hAnsi="Times New Roman" w:eastAsia="Times New Roman" w:cs="Times New Roman"/>
                 <w:b/>
-                <w:sz w:val="24"/>
+                <w:i/>
+                <w:sz w:val="21"/>
+              </w:rPr>
+              <w:t>Unit Title</w:t>
+            </w:r>
+          </w:p>
+        </w:tc>
+        <w:tc>
+          <w:tcPr>
+            <w:tcW w:type="dxa" w:w="6605"/>
+            <w:tcBorders>
+              <w:top w:val="single" w:sz="6" w:color="000000"/>
+              <w:left w:val="single" w:sz="6" w:color="000000"/>
+              <w:bottom w:val="single" w:sz="6" w:color="000000"/>
+              <w:right w:val="single" w:sz="6" w:color="000000"/>
+            </w:tcBorders>
+          </w:tcPr>
+          <w:p>
+            <w:pPr>
+              <w:pStyle w:val="TableText"/>
+              <w:spacing w:line="240" w:lineRule="auto" w:before="70" w:after="70"/>
+            </w:pPr>
+            <w:r>
+              <w:rPr>
+                <w:rFonts w:ascii="Times New Roman" w:hAnsi="Times New Roman" w:eastAsia="Times New Roman" w:cs="Times New Roman"/>
+                <w:b w:val="0"/>
+                <w:i w:val="0"/>
+                <w:sz w:val="21"/>
+              </w:rPr>
+              <w:t>Unit 3: Data Structures and Algorithms in Software</w:t>
+            </w:r>
+          </w:p>
+        </w:tc>
+      </w:tr>
+      <w:tr>
+        <w:tc>
+          <w:tcPr>
+            <w:tcW w:type="dxa" w:w="3260"/>
+            <w:tcBorders>
+              <w:top w:val="single" w:sz="6" w:color="000000"/>
+              <w:left w:val="single" w:sz="6" w:color="000000"/>
+              <w:bottom w:val="single" w:sz="6" w:color="000000"/>
+              <w:right w:val="single" w:sz="6" w:color="000000"/>
+            </w:tcBorders>
+          </w:tcPr>
+          <w:p>
+            <w:pPr>
+              <w:pStyle w:val="TableText"/>
+              <w:spacing w:line="240" w:lineRule="auto" w:before="70" w:after="70"/>
+            </w:pPr>
+            <w:r>
+              <w:rPr>
+                <w:rFonts w:ascii="Times New Roman" w:hAnsi="Times New Roman" w:eastAsia="Times New Roman" w:cs="Times New Roman"/>
+                <w:b/>
+                <w:i/>
+                <w:sz w:val="21"/>
+              </w:rPr>
+              <w:t>Assignment Title</w:t>
+            </w:r>
+          </w:p>
+        </w:tc>
+        <w:tc>
+          <w:tcPr>
+            <w:tcW w:type="dxa" w:w="6605"/>
+            <w:tcBorders>
+              <w:top w:val="single" w:sz="6" w:color="000000"/>
+              <w:left w:val="single" w:sz="6" w:color="000000"/>
+              <w:bottom w:val="single" w:sz="6" w:color="000000"/>
+              <w:right w:val="single" w:sz="6" w:color="000000"/>
+            </w:tcBorders>
+          </w:tcPr>
+          <w:p>
+            <w:pPr>
+              <w:pStyle w:val="TableText"/>
+              <w:spacing w:line="240" w:lineRule="auto" w:before="70" w:after="70"/>
+            </w:pPr>
+            <w:r>
+              <w:rPr>
+                <w:rFonts w:ascii="Times New Roman" w:hAnsi="Times New Roman" w:eastAsia="Times New Roman" w:cs="Times New Roman"/>
+                <w:b w:val="0"/>
+                <w:i w:val="0"/>
+                <w:sz w:val="21"/>
+              </w:rPr>
+              <w:t>Inserting a New Cell at the End of a Linked List</w:t>
+            </w:r>
+          </w:p>
+        </w:tc>
+      </w:tr>
+      <w:tr>
+        <w:tc>
+          <w:tcPr>
+            <w:tcW w:type="dxa" w:w="3260"/>
+            <w:tcBorders>
+              <w:top w:val="single" w:sz="6" w:color="000000"/>
+              <w:left w:val="single" w:sz="6" w:color="000000"/>
+              <w:bottom w:val="single" w:sz="6" w:color="000000"/>
+              <w:right w:val="single" w:sz="6" w:color="000000"/>
+            </w:tcBorders>
+          </w:tcPr>
+          <w:p>
+            <w:pPr>
+              <w:pStyle w:val="TableText"/>
+              <w:spacing w:line="240" w:lineRule="auto" w:before="70" w:after="70"/>
+            </w:pPr>
+            <w:r>
+              <w:rPr>
+                <w:rFonts w:ascii="Times New Roman" w:hAnsi="Times New Roman" w:eastAsia="Times New Roman" w:cs="Times New Roman"/>
+                <w:b/>
+                <w:i/>
+                <w:sz w:val="21"/>
+              </w:rPr>
+              <w:t>Submission Date</w:t>
+            </w:r>
+          </w:p>
+        </w:tc>
+        <w:tc>
+          <w:tcPr>
+            <w:tcW w:type="dxa" w:w="6605"/>
+            <w:tcBorders>
+              <w:top w:val="single" w:sz="6" w:color="000000"/>
+              <w:left w:val="single" w:sz="6" w:color="000000"/>
+              <w:bottom w:val="single" w:sz="6" w:color="000000"/>
+              <w:right w:val="single" w:sz="6" w:color="000000"/>
+            </w:tcBorders>
+          </w:tcPr>
+          <w:p>
+            <w:pPr>
+              <w:pStyle w:val="TableText"/>
+              <w:spacing w:line="240" w:lineRule="auto" w:before="70" w:after="70"/>
+            </w:pPr>
+            <w:r>
+              <w:rPr>
+                <w:rFonts w:ascii="Times New Roman" w:hAnsi="Times New Roman" w:eastAsia="Times New Roman" w:cs="Times New Roman"/>
+                <w:b w:val="0"/>
+                <w:i w:val="0"/>
+                <w:sz w:val="21"/>
+              </w:rPr>
+            </w:r>
+          </w:p>
+        </w:tc>
+      </w:tr>
+      <w:tr>
+        <w:tc>
+          <w:tcPr>
+            <w:tcW w:type="dxa" w:w="3260"/>
+            <w:tcBorders>
+              <w:top w:val="single" w:sz="6" w:color="000000"/>
+              <w:left w:val="single" w:sz="6" w:color="000000"/>
+              <w:bottom w:val="single" w:sz="6" w:color="000000"/>
+              <w:right w:val="single" w:sz="6" w:color="000000"/>
+            </w:tcBorders>
+          </w:tcPr>
+          <w:p>
+            <w:pPr>
+              <w:pStyle w:val="TableText"/>
+              <w:spacing w:line="240" w:lineRule="auto" w:before="70" w:after="70"/>
+            </w:pPr>
+            <w:r>
+              <w:rPr>
+                <w:rFonts w:ascii="Times New Roman" w:hAnsi="Times New Roman" w:eastAsia="Times New Roman" w:cs="Times New Roman"/>
+                <w:b/>
+                <w:i/>
+                <w:sz w:val="21"/>
+              </w:rPr>
+              <w:t>Word Count</w:t>
+            </w:r>
+          </w:p>
+        </w:tc>
+        <w:tc>
+          <w:tcPr>
+            <w:tcW w:type="dxa" w:w="6605"/>
+            <w:tcBorders>
+              <w:top w:val="single" w:sz="6" w:color="000000"/>
+              <w:left w:val="single" w:sz="6" w:color="000000"/>
+              <w:bottom w:val="single" w:sz="6" w:color="000000"/>
+              <w:right w:val="single" w:sz="6" w:color="000000"/>
+            </w:tcBorders>
+          </w:tcPr>
+          <w:p>
+            <w:pPr>
+              <w:pStyle w:val="TableText"/>
+              <w:spacing w:line="240" w:lineRule="auto" w:before="70" w:after="70"/>
+            </w:pPr>
+            <w:r>
+              <w:rPr>
+                <w:rFonts w:ascii="Times New Roman" w:hAnsi="Times New Roman" w:eastAsia="Times New Roman" w:cs="Times New Roman"/>
+                <w:b w:val="0"/>
+                <w:i w:val="0"/>
+                <w:sz w:val="21"/>
+              </w:rPr>
+              <w:t>4,339 words (excluding the front page, contents, figures, code, references and appendices)</w:t>
+            </w:r>
+          </w:p>
+        </w:tc>
+      </w:tr>
+    </w:tbl>
+    <w:tbl>
+      <w:tblPr>
+        <w:tblW w:type="dxa" w:w="9865"/>
+        <w:tblLook w:firstColumn="1" w:firstRow="1" w:lastColumn="0" w:lastRow="0" w:noHBand="0" w:noVBand="1" w:val="04A0"/>
+      </w:tblPr>
+      <w:tblGrid>
+        <w:gridCol w:w="9865"/>
+      </w:tblGrid>
+      <w:tr>
+        <w:tc>
+          <w:tcPr>
+            <w:tcW w:type="dxa" w:w="9865"/>
+            <w:tcBorders>
+              <w:top w:val="single" w:sz="6" w:color="000000"/>
+              <w:left w:val="single" w:sz="6" w:color="000000"/>
+              <w:bottom w:val="single" w:sz="6" w:color="000000"/>
+              <w:right w:val="single" w:sz="6" w:color="000000"/>
+            </w:tcBorders>
+          </w:tcPr>
+          <w:p>
+            <w:pPr>
+              <w:pStyle w:val="TableText"/>
+              <w:spacing w:line="240" w:lineRule="auto" w:before="140" w:after="120"/>
+            </w:pPr>
+            <w:r>
+              <w:rPr>
+                <w:rFonts w:ascii="Times New Roman" w:hAnsi="Times New Roman" w:eastAsia="Times New Roman" w:cs="Times New Roman"/>
+                <w:b/>
+                <w:i w:val="0"/>
+                <w:sz w:val="21"/>
               </w:rPr>
               <w:t>Declaration of authenticity:</w:t>
             </w:r>
@@ -775,16 +815,17 @@
             <w:pPr>
               <w:pStyle w:val="TableText"/>
               <w:tabs>
-                <w:tab w:pos="624" w:val="left"/>
+                <w:tab w:pos="539" w:val="left"/>
               </w:tabs>
-              <w:spacing w:after="80"/>
-              <w:ind w:left="624" w:hanging="340"/>
+              <w:spacing w:line="240" w:lineRule="auto" w:before="0" w:after="80"/>
+              <w:ind w:left="539" w:hanging="283"/>
             </w:pPr>
             <w:r>
               <w:rPr>
                 <w:rFonts w:ascii="Times New Roman" w:hAnsi="Times New Roman" w:eastAsia="Times New Roman" w:cs="Times New Roman"/>
                 <w:b/>
-                <w:sz w:val="24"/>
+                <w:i w:val="0"/>
+                <w:sz w:val="21"/>
               </w:rPr>
               <w:t>1.</w:t>
               <w:tab/>
@@ -795,16 +836,17 @@
             <w:pPr>
               <w:pStyle w:val="TableText"/>
               <w:tabs>
-                <w:tab w:pos="624" w:val="left"/>
+                <w:tab w:pos="539" w:val="left"/>
               </w:tabs>
-              <w:spacing w:after="80"/>
-              <w:ind w:left="624" w:hanging="340"/>
+              <w:spacing w:line="240" w:lineRule="auto" w:before="0" w:after="80"/>
+              <w:ind w:left="539" w:hanging="283"/>
             </w:pPr>
             <w:r>
               <w:rPr>
                 <w:rFonts w:ascii="Times New Roman" w:hAnsi="Times New Roman" w:eastAsia="Times New Roman" w:cs="Times New Roman"/>
                 <w:b/>
-                <w:sz w:val="24"/>
+                <w:i w:val="0"/>
+                <w:sz w:val="21"/>
               </w:rPr>
               <w:t>2.</w:t>
               <w:tab/>
@@ -815,16 +857,17 @@
             <w:pPr>
               <w:pStyle w:val="TableText"/>
               <w:tabs>
-                <w:tab w:pos="624" w:val="left"/>
+                <w:tab w:pos="539" w:val="left"/>
               </w:tabs>
-              <w:spacing w:after="80"/>
-              <w:ind w:left="624" w:hanging="340"/>
+              <w:spacing w:line="240" w:lineRule="auto" w:before="0" w:after="180"/>
+              <w:ind w:left="539" w:hanging="283"/>
             </w:pPr>
             <w:r>
               <w:rPr>
                 <w:rFonts w:ascii="Times New Roman" w:hAnsi="Times New Roman" w:eastAsia="Times New Roman" w:cs="Times New Roman"/>
                 <w:b/>
-                <w:sz w:val="24"/>
+                <w:i w:val="0"/>
+                <w:sz w:val="21"/>
               </w:rPr>
               <w:t>3.</w:t>
               <w:tab/>
@@ -836,17 +879,17 @@
     </w:tbl>
     <w:tbl>
       <w:tblPr>
-        <w:tblW w:type="dxa" w:w="9014"/>
+        <w:tblW w:type="dxa" w:w="9865"/>
         <w:tblLook w:firstColumn="1" w:firstRow="1" w:lastColumn="0" w:lastRow="0" w:noHBand="0" w:noVBand="1" w:val="04A0"/>
       </w:tblPr>
       <w:tblGrid>
-        <w:gridCol w:w="4507"/>
-        <w:gridCol w:w="4507"/>
+        <w:gridCol w:w="4932"/>
+        <w:gridCol w:w="4932"/>
       </w:tblGrid>
       <w:tr>
         <w:tc>
           <w:tcPr>
-            <w:tcW w:type="dxa" w:w="4507"/>
+            <w:tcW w:type="dxa" w:w="4932"/>
             <w:tcBorders>
               <w:top w:val="single" w:sz="6" w:color="000000"/>
               <w:left w:val="single" w:sz="6" w:color="000000"/>
@@ -857,14 +900,14 @@
           <w:p>
             <w:pPr>
               <w:pStyle w:val="TableText"/>
-              <w:spacing w:after="600"/>
+              <w:spacing w:line="240" w:lineRule="auto" w:before="720" w:after="0"/>
               <w:jc w:val="center"/>
             </w:pPr>
           </w:p>
           <w:p>
             <w:pPr>
               <w:pStyle w:val="TableText"/>
-              <w:spacing w:after="20"/>
+              <w:spacing w:line="240" w:lineRule="auto" w:before="0" w:after="20"/>
               <w:jc w:val="center"/>
             </w:pPr>
             <w:r>
@@ -872,7 +915,7 @@
                 <w:rFonts w:ascii="Times New Roman" w:hAnsi="Times New Roman" w:eastAsia="Times New Roman" w:cs="Times New Roman"/>
                 <w:b w:val="0"/>
                 <w:i w:val="0"/>
-                <w:sz w:val="24"/>
+                <w:sz w:val="21"/>
               </w:rPr>
               <w:t>_________________</w:t>
             </w:r>
@@ -880,7 +923,7 @@
           <w:p>
             <w:pPr>
               <w:pStyle w:val="TableText"/>
-              <w:spacing w:after="20"/>
+              <w:spacing w:line="240" w:lineRule="auto" w:before="0" w:after="20"/>
               <w:jc w:val="center"/>
             </w:pPr>
             <w:r>
@@ -888,7 +931,7 @@
                 <w:rFonts w:ascii="Times New Roman" w:hAnsi="Times New Roman" w:eastAsia="Times New Roman" w:cs="Times New Roman"/>
                 <w:b/>
                 <w:i/>
-                <w:sz w:val="24"/>
+                <w:sz w:val="21"/>
               </w:rPr>
               <w:t>Learner signature</w:t>
             </w:r>
@@ -896,7 +939,7 @@
           <w:p>
             <w:pPr>
               <w:pStyle w:val="TableText"/>
-              <w:spacing w:after="20"/>
+              <w:spacing w:line="240" w:lineRule="auto" w:before="0" w:after="160"/>
               <w:jc w:val="center"/>
             </w:pPr>
             <w:r>
@@ -904,7 +947,7 @@
                 <w:rFonts w:ascii="Times New Roman" w:hAnsi="Times New Roman" w:eastAsia="Times New Roman" w:cs="Times New Roman"/>
                 <w:b/>
                 <w:i/>
-                <w:sz w:val="24"/>
+                <w:sz w:val="21"/>
               </w:rPr>
               <w:t>Date:</w:t>
             </w:r>
@@ -912,7 +955,7 @@
         </w:tc>
         <w:tc>
           <w:tcPr>
-            <w:tcW w:type="dxa" w:w="4507"/>
+            <w:tcW w:type="dxa" w:w="4932"/>
             <w:tcBorders>
               <w:top w:val="single" w:sz="6" w:color="000000"/>
               <w:left w:val="single" w:sz="6" w:color="000000"/>
@@ -923,14 +966,14 @@
           <w:p>
             <w:pPr>
               <w:pStyle w:val="TableText"/>
-              <w:spacing w:after="600"/>
+              <w:spacing w:line="240" w:lineRule="auto" w:before="720" w:after="0"/>
               <w:jc w:val="center"/>
             </w:pPr>
           </w:p>
           <w:p>
             <w:pPr>
               <w:pStyle w:val="TableText"/>
-              <w:spacing w:after="20"/>
+              <w:spacing w:line="240" w:lineRule="auto" w:before="0" w:after="20"/>
               <w:jc w:val="center"/>
             </w:pPr>
             <w:r>
@@ -938,7 +981,7 @@
                 <w:rFonts w:ascii="Times New Roman" w:hAnsi="Times New Roman" w:eastAsia="Times New Roman" w:cs="Times New Roman"/>
                 <w:b w:val="0"/>
                 <w:i w:val="0"/>
-                <w:sz w:val="24"/>
+                <w:sz w:val="21"/>
               </w:rPr>
               <w:t>_________________</w:t>
             </w:r>
@@ -946,7 +989,7 @@
           <w:p>
             <w:pPr>
               <w:pStyle w:val="TableText"/>
-              <w:spacing w:after="20"/>
+              <w:spacing w:line="240" w:lineRule="auto" w:before="0" w:after="20"/>
               <w:jc w:val="center"/>
             </w:pPr>
             <w:r>
@@ -954,7 +997,7 @@
                 <w:rFonts w:ascii="Times New Roman" w:hAnsi="Times New Roman" w:eastAsia="Times New Roman" w:cs="Times New Roman"/>
                 <w:b/>
                 <w:i/>
-                <w:sz w:val="24"/>
+                <w:sz w:val="21"/>
               </w:rPr>
               <w:t>Tutor signature</w:t>
             </w:r>
@@ -962,7 +1005,7 @@
           <w:p>
             <w:pPr>
               <w:pStyle w:val="TableText"/>
-              <w:spacing w:after="20"/>
+              <w:spacing w:line="240" w:lineRule="auto" w:before="0" w:after="160"/>
               <w:jc w:val="center"/>
             </w:pPr>
             <w:r>
@@ -970,7 +1013,7 @@
                 <w:rFonts w:ascii="Times New Roman" w:hAnsi="Times New Roman" w:eastAsia="Times New Roman" w:cs="Times New Roman"/>
                 <w:b/>
                 <w:i/>
-                <w:sz w:val="24"/>
+                <w:sz w:val="21"/>
               </w:rPr>
               <w:t>Date:</w:t>
             </w:r>
@@ -980,16 +1023,16 @@
     </w:tbl>
     <w:tbl>
       <w:tblPr>
-        <w:tblW w:type="dxa" w:w="9014"/>
+        <w:tblW w:type="dxa" w:w="9865"/>
         <w:tblLook w:firstColumn="1" w:firstRow="1" w:lastColumn="0" w:lastRow="0" w:noHBand="0" w:noVBand="1" w:val="04A0"/>
       </w:tblPr>
       <w:tblGrid>
-        <w:gridCol w:w="9014"/>
+        <w:gridCol w:w="9865"/>
       </w:tblGrid>
       <w:tr>
         <w:tc>
           <w:tcPr>
-            <w:tcW w:type="dxa" w:w="9014"/>
+            <w:tcW w:type="dxa" w:w="9865"/>
             <w:tcBorders>
               <w:top w:val="single" w:sz="6" w:color="000000"/>
               <w:left w:val="single" w:sz="6" w:color="000000"/>
@@ -1000,11 +1043,14 @@
           <w:p>
             <w:pPr>
               <w:pStyle w:val="TableText"/>
+              <w:spacing w:line="240" w:lineRule="auto" w:before="180" w:after="180"/>
             </w:pPr>
             <w:r>
               <w:rPr>
                 <w:rFonts w:ascii="Times New Roman" w:hAnsi="Times New Roman" w:eastAsia="Times New Roman" w:cs="Times New Roman"/>
-                <w:sz w:val="24"/>
+                <w:b w:val="0"/>
+                <w:i w:val="0"/>
+                <w:sz w:val="21"/>
               </w:rPr>
               <w:t>Note:</w:t>
             </w:r>
@@ -1012,11 +1058,14 @@
           <w:p>
             <w:pPr>
               <w:pStyle w:val="TableText"/>
+              <w:spacing w:line="240" w:lineRule="auto" w:before="0" w:after="440"/>
             </w:pPr>
             <w:r>
               <w:rPr>
                 <w:rFonts w:ascii="Times New Roman" w:hAnsi="Times New Roman" w:eastAsia="Times New Roman" w:cs="Times New Roman"/>
-                <w:sz w:val="24"/>
+                <w:b w:val="0"/>
+                <w:i w:val="0"/>
+                <w:sz w:val="21"/>
               </w:rPr>
               <w:t>Assignments must be submitted in typed PDF format only; handwritten assignments are not accepted.</w:t>
             </w:r>
@@ -1025,9 +1074,15 @@
       </w:tr>
     </w:tbl>
     <w:p>
-      <w:r>
-        <w:br w:type="page"/>
-      </w:r>
+      <w:pPr>
+        <w:sectPr>
+          <w:footerReference w:type="default" r:id="rId9"/>
+          <w:pgSz w:w="11906" w:h="16838"/>
+          <w:pgMar w:top="907" w:right="1020" w:bottom="1440" w:left="1020" w:header="720" w:footer="709" w:gutter="0"/>
+          <w:cols w:space="720"/>
+          <w:docGrid w:linePitch="360"/>
+        </w:sectPr>
+      </w:pPr>
     </w:p>
     <w:p>
       <w:pPr>

</xml_diff>